<commit_message>
Update Gyeonggi committee resume v2 + founder credentials (first-in-Korea records, certs, patents, professorship)
https://claude.ai/code/session_01Y6TtAZhVDLaxNYjVmtcmpZ
</commit_message>
<xml_diff>
--- a/deliverables/하현제_경기도인수위_축산분야_이력서.docx
+++ b/deliverables/하현제_경기도인수위_축산분야_이력서.docx
@@ -10,7 +10,7 @@
           <w:color w:val="1B5E3A"/>
           <w:sz w:val="21"/>
         </w:rPr>
-        <w:t>경기도지사직 인수위원회 축산·방역 분야 위원 지원</w:t>
+        <w:t>경기도지사직 인수위원회  축산·동물방역 분야 위원 지원</w:t>
       </w:r>
     </w:p>
     <w:p>
@@ -33,20 +33,9 @@
           <w:rFonts w:ascii="Malgun Gothic" w:hAnsi="Malgun Gothic" w:eastAsia="Malgun Gothic"/>
           <w:b/>
           <w:color w:val="1A2E4F"/>
-          <w:sz w:val="22"/>
+          <w:sz w:val="21"/>
         </w:rPr>
-        <w:t>하 현 제 (Ha, Hyunje), D.V.M.   |   수의사 · 축산생명공학 전문가 · 축산환경기술 개발자</w:t>
-      </w:r>
-    </w:p>
-    <w:p>
-      <w:r>
-        <w:rPr>
-          <w:rFonts w:ascii="Malgun Gothic" w:hAnsi="Malgun Gothic" w:eastAsia="Malgun Gothic"/>
-          <w:b w:val="0"/>
-          <w:color w:val="555555"/>
-          <w:sz w:val="18"/>
-        </w:rPr>
-        <w:t>Veterinarian · Livestock Biotechnology &amp; Precision-Livestock Specialist · Agricultural Systems Architect</w:t>
+        <w:t>하 현 제 (Ha, Hyunje), D.V.M.   |   수의사 · 축산생명공학 전문가 · 축산환경기술 개발자 · 건국대 수의과대학 겸임교수</w:t>
       </w:r>
     </w:p>
     <w:p>
@@ -58,9 +47,9 @@
           <w:rFonts w:ascii="Malgun Gothic" w:hAnsi="Malgun Gothic" w:eastAsia="Malgun Gothic"/>
           <w:b w:val="0"/>
           <w:color w:val="555555"/>
-          <w:sz w:val="19"/>
+          <w:sz w:val="18"/>
         </w:rPr>
-        <w:t>휴대전화 010-6205-3150   |   이메일 hhj3150@hanmail.net   |   국가연구자번호 11152141</w:t>
+        <w:t>휴대전화 010-6205-3150   |   이메일 hhj3150@hanmail.net   |   수의사 면허 제10193호   |   국가연구자번호 11152141</w:t>
       </w:r>
     </w:p>
     <w:p>
@@ -75,9 +64,9 @@
           <w:rFonts w:ascii="Malgun Gothic" w:hAnsi="Malgun Gothic" w:eastAsia="Malgun Gothic"/>
           <w:b w:val="0"/>
           <w:color w:val="555555"/>
-          <w:sz w:val="19"/>
+          <w:sz w:val="18"/>
         </w:rPr>
-        <w:t>소속 농업회사법인 ㈜디투오(D2O) · 경기도 안성시 보개면 양협길 29-67 (우 17508) · Tel 031-674-4432</w:t>
+        <w:t>소속 농업회사법인 ㈜디투오(D2O) · 송영신목장 · 경기도 안성시 보개면 양협길 29-67 (우 17508) · Tel 031-674-4432</w:t>
       </w:r>
     </w:p>
     <w:p>
@@ -108,7 +97,162 @@
           <w:b w:val="0"/>
           <w:sz w:val="21"/>
         </w:rPr>
-        <w:t>경기도는 전국 젖소 사육두수의 40.3%, 낙농가의 38.7%를 보유한 대한민국 최대 축산 기반입니다. 본인은 경기도 안성에 본사를 둔 축산환경·생명공학 기업의 대표이자 현장 수의사로서, 약 18년간 도내 축산 현장에서 번식·환경·데이터 문제를 직접 다뤄온 당사자입니다. 경기도가 추진하는 「AI 축산행정 플랫폼」(예측·예방·정밀 행정으로의 대전환)에 현장성과 기술 전문성을 결합하여, 새 도정의 축산 정책이 실질적 성과로 이어지도록 기여하고자 인수위원에 지원합니다.</w:t>
+        <w:t>경기도는 전국 젖소 사육두수의 40.3%, 낙농가의 38.7%를 보유한 대한민국 최대 축산 기반입니다. 본인은 경기도 안성에서 젖소 동물복지·저탄소·경축순환 목장을 직접 운영하는 수의사이자, 대한민국 최초의 젖소 성감별 수정란 수출·국내 1호 스마트팜 교육목장 등 다수의 '최초·제1호' 모델을 현장에서 만들어 온 당사자입니다. 경기도가 추진하는 「AI 축산행정 플랫폼」(사후대응→예측·예방·정밀 행정 전환)에 검증된 현장 모델과 기술 전문성을 결합하여, 새 도정의 축산 정책이 전국 표준이 되도록 기여하고자 인수위원에 지원합니다.</w:t>
+      </w:r>
+    </w:p>
+    <w:p>
+      <w:pPr>
+        <w:spacing w:before="180" w:after="80"/>
+        <w:pBdr>
+          <w:bottom w:val="single" w:sz="8" w:space="1" w:color="1B5E3A"/>
+        </w:pBdr>
+      </w:pPr>
+      <w:r>
+        <w:rPr>
+          <w:rFonts w:ascii="Malgun Gothic" w:hAnsi="Malgun Gothic" w:eastAsia="Malgun Gothic"/>
+          <w:b/>
+          <w:color w:val="1A2E4F"/>
+          <w:sz w:val="25"/>
+        </w:rPr>
+        <w:t>대한민국 최초 · 국내 제1호 실적 (National First Records)</w:t>
+      </w:r>
+    </w:p>
+    <w:p>
+      <w:pPr>
+        <w:pStyle w:val="ListBullet"/>
+        <w:spacing w:after="40"/>
+      </w:pPr>
+      <w:r>
+        <w:rPr>
+          <w:rFonts w:ascii="Malgun Gothic" w:hAnsi="Malgun Gothic" w:eastAsia="Malgun Gothic"/>
+          <w:b/>
+          <w:color w:val="A01B1B"/>
+          <w:sz w:val="21"/>
+        </w:rPr>
+        <w:t xml:space="preserve">🥇 </w:t>
+      </w:r>
+      <w:r>
+        <w:rPr>
+          <w:rFonts w:ascii="Malgun Gothic" w:hAnsi="Malgun Gothic" w:eastAsia="Malgun Gothic"/>
+          <w:b w:val="0"/>
+          <w:sz w:val="21"/>
+        </w:rPr>
+        <w:t>한국 젖소(홀스타인) 성감별 수정란 수출 — 농촌진흥청 (대한민국 최초, 낙농 유전자원 수출 개척)</w:t>
+      </w:r>
+    </w:p>
+    <w:p>
+      <w:pPr>
+        <w:pStyle w:val="ListBullet"/>
+        <w:spacing w:after="40"/>
+      </w:pPr>
+      <w:r>
+        <w:rPr>
+          <w:rFonts w:ascii="Malgun Gothic" w:hAnsi="Malgun Gothic" w:eastAsia="Malgun Gothic"/>
+          <w:b/>
+          <w:color w:val="A01B1B"/>
+          <w:sz w:val="21"/>
+        </w:rPr>
+        <w:t xml:space="preserve">🥇 </w:t>
+      </w:r>
+      <w:r>
+        <w:rPr>
+          <w:rFonts w:ascii="Malgun Gothic" w:hAnsi="Malgun Gothic" w:eastAsia="Malgun Gothic"/>
+          <w:b w:val="0"/>
+          <w:sz w:val="21"/>
+        </w:rPr>
+        <w:t>피트모스 도입으로 '냄새 없는 목장 · 파리 없는 목장' 구현 — 대한민국 최초</w:t>
+      </w:r>
+    </w:p>
+    <w:p>
+      <w:pPr>
+        <w:pStyle w:val="ListBullet"/>
+        <w:spacing w:after="40"/>
+      </w:pPr>
+      <w:r>
+        <w:rPr>
+          <w:rFonts w:ascii="Malgun Gothic" w:hAnsi="Malgun Gothic" w:eastAsia="Malgun Gothic"/>
+          <w:b/>
+          <w:color w:val="A01B1B"/>
+          <w:sz w:val="21"/>
+        </w:rPr>
+        <w:t xml:space="preserve">🥇 </w:t>
+      </w:r>
+      <w:r>
+        <w:rPr>
+          <w:rFonts w:ascii="Malgun Gothic" w:hAnsi="Malgun Gothic" w:eastAsia="Malgun Gothic"/>
+          <w:b w:val="0"/>
+          <w:sz w:val="21"/>
+        </w:rPr>
+        <w:t>농림축산식품부 스마트팜 교육목장 — 국내 1호</w:t>
+      </w:r>
+    </w:p>
+    <w:p>
+      <w:pPr>
+        <w:pStyle w:val="ListBullet"/>
+        <w:spacing w:after="40"/>
+      </w:pPr>
+      <w:r>
+        <w:rPr>
+          <w:rFonts w:ascii="Malgun Gothic" w:hAnsi="Malgun Gothic" w:eastAsia="Malgun Gothic"/>
+          <w:b/>
+          <w:color w:val="A01B1B"/>
+          <w:sz w:val="21"/>
+        </w:rPr>
+        <w:t xml:space="preserve">🥇 </w:t>
+      </w:r>
+      <w:r>
+        <w:rPr>
+          <w:rFonts w:ascii="Malgun Gothic" w:hAnsi="Malgun Gothic" w:eastAsia="Malgun Gothic"/>
+          <w:b w:val="0"/>
+          <w:sz w:val="21"/>
+        </w:rPr>
+        <w:t>젖소 동물복지 인증목장 — 국내 제1호</w:t>
+      </w:r>
+    </w:p>
+    <w:p>
+      <w:pPr>
+        <w:pStyle w:val="ListBullet"/>
+        <w:spacing w:after="40"/>
+      </w:pPr>
+      <w:r>
+        <w:rPr>
+          <w:rFonts w:ascii="Malgun Gothic" w:hAnsi="Malgun Gothic" w:eastAsia="Malgun Gothic"/>
+          <w:b/>
+          <w:color w:val="A01B1B"/>
+          <w:sz w:val="21"/>
+        </w:rPr>
+        <w:t xml:space="preserve">🥇 </w:t>
+      </w:r>
+      <w:r>
+        <w:rPr>
+          <w:rFonts w:ascii="Malgun Gothic" w:hAnsi="Malgun Gothic" w:eastAsia="Malgun Gothic"/>
+          <w:b w:val="0"/>
+          <w:sz w:val="21"/>
+        </w:rPr>
+        <w:t>젖소 저탄소 인증목장 — 국내 제1호</w:t>
+      </w:r>
+    </w:p>
+    <w:p>
+      <w:pPr>
+        <w:pStyle w:val="ListBullet"/>
+        <w:spacing w:after="40"/>
+      </w:pPr>
+      <w:r>
+        <w:rPr>
+          <w:rFonts w:ascii="Malgun Gothic" w:hAnsi="Malgun Gothic" w:eastAsia="Malgun Gothic"/>
+          <w:b/>
+          <w:color w:val="A01B1B"/>
+          <w:sz w:val="21"/>
+        </w:rPr>
+        <w:t xml:space="preserve">🥇 </w:t>
+      </w:r>
+      <w:r>
+        <w:rPr>
+          <w:rFonts w:ascii="Malgun Gothic" w:hAnsi="Malgun Gothic" w:eastAsia="Malgun Gothic"/>
+          <w:b w:val="0"/>
+          <w:sz w:val="21"/>
+        </w:rPr>
+        <w:t>경기도 저지(Jersey) 전용목장 2호 (송영신목장)</w:t>
       </w:r>
     </w:p>
     <w:p>
@@ -148,7 +292,7 @@
           <w:b w:val="0"/>
           <w:sz w:val="21"/>
         </w:rPr>
-        <w:t>D2O 본사가 경기 안성 소재 — 외부 자문이 아닌 경기 축산 현장의 당사자·이해관계자</w:t>
+        <w:t>경기 안성에서 인증목장을 직접 운영 — 외부 자문이 아닌 경기 축산 현장의 당사자</w:t>
       </w:r>
     </w:p>
     <w:p>
@@ -171,7 +315,7 @@
           <w:b w:val="0"/>
           <w:sz w:val="21"/>
         </w:rPr>
-        <w:t>수의사 면허 + 약 18년 수정란이식·번식 임상 (연 3,000건 이식·4,000개 공급·수태율 60%)</w:t>
+        <w:t>수의사(면허 제10193호) + 약 18년 번식·수정란이식 임상 (연 3,000건 이식·4,000개 공급·수태율 60%)</w:t>
       </w:r>
     </w:p>
     <w:p>
@@ -186,7 +330,7 @@
           <w:color w:val="1B5E3A"/>
           <w:sz w:val="21"/>
         </w:rPr>
-        <w:t xml:space="preserve">③ AI 축산행정 역량: </w:t>
+        <w:t xml:space="preserve">③ 정책 인증 실증: </w:t>
       </w:r>
       <w:r>
         <w:rPr>
@@ -194,7 +338,7 @@
           <w:b w:val="0"/>
           <w:sz w:val="21"/>
         </w:rPr>
-        <w:t>반추위센서·AI 모니터링·질병/분만 예측 등 정밀축산 디지털 플랫폼(Eco-BIT·CowTalk AI) 설계·운영</w:t>
+        <w:t>동물복지·저탄소·경축순환·깨끗한 목장·가축행복농장 — 정책 인증을 모두 현장에서 달성·검증</w:t>
       </w:r>
     </w:p>
     <w:p>
@@ -209,7 +353,7 @@
           <w:color w:val="1B5E3A"/>
           <w:sz w:val="21"/>
         </w:rPr>
-        <w:t xml:space="preserve">④ 환경·민원 해법: </w:t>
+        <w:t xml:space="preserve">④ AI 축산행정 역량: </w:t>
       </w:r>
       <w:r>
         <w:rPr>
@@ -217,7 +361,7 @@
           <w:b w:val="0"/>
           <w:sz w:val="21"/>
         </w:rPr>
-        <w:t>악취·분뇨·탄소 저감 및 바이오 베딩·퇴비화 — 양돈 민원·환경규제 대응 핵심 기술 보유</w:t>
+        <w:t>정밀축산 AI 플랫폼(Eco-BIT·CowTalk AI) 설계·운영 — 경기 AI 축산행정 사업과 직결</w:t>
       </w:r>
     </w:p>
     <w:p>
@@ -232,7 +376,7 @@
           <w:color w:val="1B5E3A"/>
           <w:sz w:val="21"/>
         </w:rPr>
-        <w:t xml:space="preserve">⑤ 공공협력 실적: </w:t>
+        <w:t xml:space="preserve">⑤ 학술·국제 신뢰: </w:t>
       </w:r>
       <w:r>
         <w:rPr>
@@ -240,7 +384,7 @@
           <w:b w:val="0"/>
           <w:sz w:val="21"/>
         </w:rPr>
-        <w:t>산업통상자원부(MOTIE) 3년 R&amp;D 공동연구개발기관 연구책임자 — 검증된 공공-민간 협력 수행 경험</w:t>
+        <w:t>건국대 수의과대학 겸임교수·한경대 축산전문강사·KOICA/KOPIA 전문요원 — 교육·국제협력 검증</w:t>
       </w:r>
     </w:p>
     <w:p>
@@ -269,7 +413,7 @@
         <w:rPr>
           <w:rFonts w:ascii="Malgun Gothic" w:hAnsi="Malgun Gothic" w:eastAsia="Malgun Gothic"/>
           <w:b/>
-          <w:color w:val="9A6B1E"/>
+          <w:color w:val="8A5A0E"/>
           <w:sz w:val="21"/>
         </w:rPr>
         <w:t xml:space="preserve">데이터 기반 축산행정(AX): </w:t>
@@ -280,7 +424,7 @@
           <w:b w:val="0"/>
           <w:sz w:val="21"/>
         </w:rPr>
-        <w:t>공공·민간·ICT 센서 데이터를 표준화·통합해 사후 보고 → 예측·예방 행정으로 전환하는 설계 자문</w:t>
+        <w:t>공공·민간·ICT 센서 데이터 표준화·통합으로 사후보고→예측·예방 행정 전환 설계 자문</w:t>
       </w:r>
     </w:p>
     <w:p>
@@ -292,10 +436,10 @@
         <w:rPr>
           <w:rFonts w:ascii="Malgun Gothic" w:hAnsi="Malgun Gothic" w:eastAsia="Malgun Gothic"/>
           <w:b/>
-          <w:color w:val="9A6B1E"/>
+          <w:color w:val="8A5A0E"/>
           <w:sz w:val="21"/>
         </w:rPr>
-        <w:t xml:space="preserve">정밀 방역·가축질병 예방: </w:t>
+        <w:t xml:space="preserve">정밀 방역·질병예방: </w:t>
       </w:r>
       <w:r>
         <w:rPr>
@@ -303,7 +447,7 @@
           <w:b w:val="0"/>
           <w:sz w:val="21"/>
         </w:rPr>
-        <w:t>반추위센서 기반 소모성 질병(유방염·케토시스·유열) 사전예방 행정 근거 마련 — 도내 낙농 ICT 실증 연계</w:t>
+        <w:t>반추위센서 기반 소모성 질병(유방염·케토시스·유열) 사전예방 행정 근거 마련</w:t>
       </w:r>
     </w:p>
     <w:p>
@@ -315,10 +459,10 @@
         <w:rPr>
           <w:rFonts w:ascii="Malgun Gothic" w:hAnsi="Malgun Gothic" w:eastAsia="Malgun Gothic"/>
           <w:b/>
-          <w:color w:val="9A6B1E"/>
+          <w:color w:val="8A5A0E"/>
           <w:sz w:val="21"/>
         </w:rPr>
-        <w:t xml:space="preserve">축산환경·악취·탄소중립: </w:t>
+        <w:t xml:space="preserve">축산환경·악취 민원: </w:t>
       </w:r>
       <w:r>
         <w:rPr>
@@ -326,7 +470,7 @@
           <w:b w:val="0"/>
           <w:sz w:val="21"/>
         </w:rPr>
-        <w:t>바이오 베딩·악취저감·퇴비 자원화로 양돈 냄새 민원·분뇨 문제의 구조적 해법 제시</w:t>
+        <w:t>피트모스·바이오베딩 기반 '냄새·파리 없는 목장' 모델로 양돈·축산 악취 민원 구조적 해법</w:t>
       </w:r>
     </w:p>
     <w:p>
@@ -338,10 +482,10 @@
         <w:rPr>
           <w:rFonts w:ascii="Malgun Gothic" w:hAnsi="Malgun Gothic" w:eastAsia="Malgun Gothic"/>
           <w:b/>
-          <w:color w:val="9A6B1E"/>
+          <w:color w:val="8A5A0E"/>
           <w:sz w:val="21"/>
         </w:rPr>
-        <w:t xml:space="preserve">동물복지·농가 수익성 동시 제고: </w:t>
+        <w:t xml:space="preserve">탄소중립·동물복지 표준화: </w:t>
       </w:r>
       <w:r>
         <w:rPr>
@@ -349,7 +493,7 @@
           <w:b w:val="0"/>
           <w:sz w:val="21"/>
         </w:rPr>
-        <w:t>동물복지형 사육환경 기준과 생산성·수익성을 양립시키는 현장 실행모델 제안</w:t>
+        <w:t>국내 1호 저탄소·동물복지 인증목장 모델을 경기 표준으로 확산 (경축순환·탄소중립)</w:t>
       </w:r>
     </w:p>
     <w:p>
@@ -361,10 +505,10 @@
         <w:rPr>
           <w:rFonts w:ascii="Malgun Gothic" w:hAnsi="Malgun Gothic" w:eastAsia="Malgun Gothic"/>
           <w:b/>
-          <w:color w:val="9A6B1E"/>
+          <w:color w:val="8A5A0E"/>
           <w:sz w:val="21"/>
         </w:rPr>
-        <w:t xml:space="preserve">축산 전 축종 확산 로드맵: </w:t>
+        <w:t xml:space="preserve">후계농 육성·스마트팜 교육: </w:t>
       </w:r>
       <w:r>
         <w:rPr>
@@ -372,188 +516,9 @@
           <w:b w:val="0"/>
           <w:sz w:val="21"/>
         </w:rPr>
-        <w:t>낙농 ICT 시범 → 한우(이력·번식)·양돈(질병·분뇨) 확산의 단계적 로드맵 자문</w:t>
+        <w:t>국내 1호 스마트팜 교육목장 경험으로 도내 청년·후계농 교육·창업 기반 설계</w:t>
       </w:r>
     </w:p>
-    <w:p>
-      <w:pPr>
-        <w:spacing w:before="180" w:after="80"/>
-        <w:pBdr>
-          <w:bottom w:val="single" w:sz="8" w:space="1" w:color="1B5E3A"/>
-        </w:pBdr>
-      </w:pPr>
-      <w:r>
-        <w:rPr>
-          <w:rFonts w:ascii="Malgun Gothic" w:hAnsi="Malgun Gothic" w:eastAsia="Malgun Gothic"/>
-          <w:b/>
-          <w:color w:val="1A2E4F"/>
-          <w:sz w:val="25"/>
-        </w:rPr>
-        <w:t>핵심 전문 역량 (Core Competencies)</w:t>
-      </w:r>
-    </w:p>
-    <w:tbl>
-      <w:tblPr>
-        <w:tblW w:type="auto" w:w="0"/>
-        <w:tblLook w:firstColumn="1" w:firstRow="1" w:lastColumn="0" w:lastRow="0" w:noHBand="0" w:noVBand="1" w:val="04A0"/>
-      </w:tblPr>
-      <w:tblGrid>
-        <w:gridCol w:w="4986"/>
-        <w:gridCol w:w="4986"/>
-      </w:tblGrid>
-      <w:tr>
-        <w:tc>
-          <w:tcPr>
-            <w:tcW w:type="dxa" w:w="4986"/>
-          </w:tcPr>
-          <w:p>
-            <w:pPr>
-              <w:spacing w:after="20"/>
-            </w:pPr>
-            <w:r>
-              <w:rPr>
-                <w:rFonts w:ascii="Malgun Gothic" w:hAnsi="Malgun Gothic" w:eastAsia="Malgun Gothic"/>
-                <w:b w:val="0"/>
-                <w:sz w:val="20"/>
-              </w:rPr>
-              <w:t>•  수의 임상 · 번식관리 · 수정란이식(OPU/IVF/동결)</w:t>
-            </w:r>
-          </w:p>
-        </w:tc>
-        <w:tc>
-          <w:tcPr>
-            <w:tcW w:type="dxa" w:w="4986"/>
-          </w:tcPr>
-          <w:p>
-            <w:pPr>
-              <w:spacing w:after="20"/>
-            </w:pPr>
-            <w:r>
-              <w:rPr>
-                <w:rFonts w:ascii="Malgun Gothic" w:hAnsi="Malgun Gothic" w:eastAsia="Malgun Gothic"/>
-                <w:b w:val="0"/>
-                <w:sz w:val="20"/>
-              </w:rPr>
-              <w:t>•  축산환경기술(악취·분뇨·바이오 베딩·퇴비화)</w:t>
-            </w:r>
-          </w:p>
-        </w:tc>
-      </w:tr>
-      <w:tr>
-        <w:tc>
-          <w:tcPr>
-            <w:tcW w:type="dxa" w:w="4986"/>
-          </w:tcPr>
-          <w:p>
-            <w:pPr>
-              <w:spacing w:after="20"/>
-            </w:pPr>
-            <w:r>
-              <w:rPr>
-                <w:rFonts w:ascii="Malgun Gothic" w:hAnsi="Malgun Gothic" w:eastAsia="Malgun Gothic"/>
-                <w:b w:val="0"/>
-                <w:sz w:val="20"/>
-              </w:rPr>
-              <w:t>•  유전체 선발 · 젖소/한우 개량 · A2 유전 프로그램</w:t>
-            </w:r>
-          </w:p>
-        </w:tc>
-        <w:tc>
-          <w:tcPr>
-            <w:tcW w:type="dxa" w:w="4986"/>
-          </w:tcPr>
-          <w:p>
-            <w:pPr>
-              <w:spacing w:after="20"/>
-            </w:pPr>
-            <w:r>
-              <w:rPr>
-                <w:rFonts w:ascii="Malgun Gothic" w:hAnsi="Malgun Gothic" w:eastAsia="Malgun Gothic"/>
-                <w:b w:val="0"/>
-                <w:sz w:val="20"/>
-              </w:rPr>
-              <w:t>•  탄소저감 · 탄소회계 · ESG · 순환농업</w:t>
-            </w:r>
-          </w:p>
-        </w:tc>
-      </w:tr>
-      <w:tr>
-        <w:tc>
-          <w:tcPr>
-            <w:tcW w:type="dxa" w:w="4986"/>
-          </w:tcPr>
-          <w:p>
-            <w:pPr>
-              <w:spacing w:after="20"/>
-            </w:pPr>
-            <w:r>
-              <w:rPr>
-                <w:rFonts w:ascii="Malgun Gothic" w:hAnsi="Malgun Gothic" w:eastAsia="Malgun Gothic"/>
-                <w:b w:val="0"/>
-                <w:sz w:val="20"/>
-              </w:rPr>
-              <w:t>•  정밀축산(위내센서·AI 예측·질병/분만 모니터링)</w:t>
-            </w:r>
-          </w:p>
-        </w:tc>
-        <w:tc>
-          <w:tcPr>
-            <w:tcW w:type="dxa" w:w="4986"/>
-          </w:tcPr>
-          <w:p>
-            <w:pPr>
-              <w:spacing w:after="20"/>
-            </w:pPr>
-            <w:r>
-              <w:rPr>
-                <w:rFonts w:ascii="Malgun Gothic" w:hAnsi="Malgun Gothic" w:eastAsia="Malgun Gothic"/>
-                <w:b w:val="0"/>
-                <w:sz w:val="20"/>
-              </w:rPr>
-              <w:t>•  정부 R&amp;D 과제 수행 · 정책 제안 · 지자체 협력</w:t>
-            </w:r>
-          </w:p>
-        </w:tc>
-      </w:tr>
-      <w:tr>
-        <w:tc>
-          <w:tcPr>
-            <w:tcW w:type="dxa" w:w="4986"/>
-          </w:tcPr>
-          <w:p>
-            <w:pPr>
-              <w:spacing w:after="20"/>
-            </w:pPr>
-            <w:r>
-              <w:rPr>
-                <w:rFonts w:ascii="Malgun Gothic" w:hAnsi="Malgun Gothic" w:eastAsia="Malgun Gothic"/>
-                <w:b w:val="0"/>
-                <w:sz w:val="20"/>
-              </w:rPr>
-              <w:t>•  축산 데이터 통합·표준화 · AI 행정 플랫폼 설계</w:t>
-            </w:r>
-          </w:p>
-        </w:tc>
-        <w:tc>
-          <w:tcPr>
-            <w:tcW w:type="dxa" w:w="4986"/>
-          </w:tcPr>
-          <w:p>
-            <w:pPr>
-              <w:spacing w:after="20"/>
-            </w:pPr>
-            <w:r>
-              <w:rPr>
-                <w:rFonts w:ascii="Malgun Gothic" w:hAnsi="Malgun Gothic" w:eastAsia="Malgun Gothic"/>
-                <w:b w:val="0"/>
-                <w:sz w:val="20"/>
-              </w:rPr>
-              <w:t>•  프리미엄 유가공·축산 6차산업 사업화</w:t>
-            </w:r>
-          </w:p>
-        </w:tc>
-      </w:tr>
-    </w:tbl>
     <w:p>
       <w:pPr>
         <w:spacing w:before="180" w:after="80"/>
@@ -573,14 +538,14 @@
     </w:p>
     <w:p>
       <w:pPr>
-        <w:spacing w:before="120" w:after="20"/>
+        <w:spacing w:before="100" w:after="20"/>
       </w:pPr>
       <w:r>
         <w:rPr>
           <w:rFonts w:ascii="Malgun Gothic" w:hAnsi="Malgun Gothic" w:eastAsia="Malgun Gothic"/>
           <w:b/>
           <w:color w:val="1A2E4F"/>
-          <w:sz w:val="23"/>
+          <w:sz w:val="22"/>
         </w:rPr>
         <w:t>고려동물병원 · 농업회사법인 ㈜제네틱스</w:t>
       </w:r>
@@ -589,7 +554,7 @@
           <w:rFonts w:ascii="Malgun Gothic" w:hAnsi="Malgun Gothic" w:eastAsia="Malgun Gothic"/>
           <w:b w:val="0"/>
           <w:color w:val="1B5E3A"/>
-          <w:sz w:val="20"/>
+          <w:sz w:val="19"/>
         </w:rPr>
         <w:t xml:space="preserve">   —  원장 / 대표</w:t>
       </w:r>
@@ -617,9 +582,9 @@
         <w:rPr>
           <w:rFonts w:ascii="Malgun Gothic" w:hAnsi="Malgun Gothic" w:eastAsia="Malgun Gothic"/>
           <w:b w:val="0"/>
-          <w:sz w:val="21"/>
+          <w:sz w:val="20"/>
         </w:rPr>
-        <w:t>수정란 생산·이식, 유전체 분석, 젖소·한우 개량 사업 총괄</w:t>
+        <w:t>수정란 생산·이식, 유전체 분석, 젖소·한우 개량 총괄 (연 3,000건 이식·4,000개 공급·수태율 60%)</w:t>
       </w:r>
     </w:p>
     <w:p>
@@ -631,9 +596,46 @@
         <w:rPr>
           <w:rFonts w:ascii="Malgun Gothic" w:hAnsi="Malgun Gothic" w:eastAsia="Malgun Gothic"/>
           <w:b w:val="0"/>
-          <w:sz w:val="21"/>
+          <w:sz w:val="20"/>
         </w:rPr>
-        <w:t>연간 약 3,000건 수정란 이식 · 약 4,000개 공급 · 평균 수태율 약 60%</w:t>
+        <w:t>대한민국 최초 한국 젖소 성감별 수정란 수출 (농촌진흥청)</w:t>
+      </w:r>
+    </w:p>
+    <w:p>
+      <w:pPr>
+        <w:spacing w:before="100" w:after="20"/>
+      </w:pPr>
+      <w:r>
+        <w:rPr>
+          <w:rFonts w:ascii="Malgun Gothic" w:hAnsi="Malgun Gothic" w:eastAsia="Malgun Gothic"/>
+          <w:b/>
+          <w:color w:val="1A2E4F"/>
+          <w:sz w:val="22"/>
+        </w:rPr>
+        <w:t>송영신목장 (경기도 저지전용목장 2호)</w:t>
+      </w:r>
+      <w:r>
+        <w:rPr>
+          <w:rFonts w:ascii="Malgun Gothic" w:hAnsi="Malgun Gothic" w:eastAsia="Malgun Gothic"/>
+          <w:b w:val="0"/>
+          <w:color w:val="1B5E3A"/>
+          <w:sz w:val="19"/>
+        </w:rPr>
+        <w:t xml:space="preserve">   —  대표 / 운영</w:t>
+      </w:r>
+    </w:p>
+    <w:p>
+      <w:pPr>
+        <w:spacing w:after="40"/>
+      </w:pPr>
+      <w:r>
+        <w:rPr>
+          <w:rFonts w:ascii="Malgun Gothic" w:hAnsi="Malgun Gothic" w:eastAsia="Malgun Gothic"/>
+          <w:b w:val="0"/>
+          <w:color w:val="555555"/>
+          <w:sz w:val="18"/>
+        </w:rPr>
+        <w:t>현재 · 경기 안성</w:t>
       </w:r>
     </w:p>
     <w:p>
@@ -645,21 +647,35 @@
         <w:rPr>
           <w:rFonts w:ascii="Malgun Gothic" w:hAnsi="Malgun Gothic" w:eastAsia="Malgun Gothic"/>
           <w:b w:val="0"/>
-          <w:sz w:val="21"/>
+          <w:sz w:val="20"/>
         </w:rPr>
-        <w:t>번식관리·수란우관리·송아지 건강·농가 컨설팅 (수의 전문 인력 팀 운영)</w:t>
+        <w:t>국내 1호 젖소 동물복지·저탄소 인증, 깨끗한 목장·경기도 가축행복농장 인증</w:t>
       </w:r>
     </w:p>
     <w:p>
       <w:pPr>
-        <w:spacing w:before="120" w:after="20"/>
+        <w:pStyle w:val="ListBullet"/>
+        <w:spacing w:after="40"/>
+      </w:pPr>
+      <w:r>
+        <w:rPr>
+          <w:rFonts w:ascii="Malgun Gothic" w:hAnsi="Malgun Gothic" w:eastAsia="Malgun Gothic"/>
+          <w:b w:val="0"/>
+          <w:sz w:val="20"/>
+        </w:rPr>
+        <w:t>피트모스 기반 냄새·파리 없는 목장, 경축순환모델, A2 저지 유가공 6차산업</w:t>
+      </w:r>
+    </w:p>
+    <w:p>
+      <w:pPr>
+        <w:spacing w:before="100" w:after="20"/>
       </w:pPr>
       <w:r>
         <w:rPr>
           <w:rFonts w:ascii="Malgun Gothic" w:hAnsi="Malgun Gothic" w:eastAsia="Malgun Gothic"/>
           <w:b/>
           <w:color w:val="1A2E4F"/>
-          <w:sz w:val="23"/>
+          <w:sz w:val="22"/>
         </w:rPr>
         <w:t>농업회사법인 ㈜디투오(D2O)</w:t>
       </w:r>
@@ -668,7 +684,7 @@
           <w:rFonts w:ascii="Malgun Gothic" w:hAnsi="Malgun Gothic" w:eastAsia="Malgun Gothic"/>
           <w:b w:val="0"/>
           <w:color w:val="1B5E3A"/>
-          <w:sz w:val="20"/>
+          <w:sz w:val="19"/>
         </w:rPr>
         <w:t xml:space="preserve">   —  이사(기술지원) / 환경기술 개발</w:t>
       </w:r>
@@ -684,7 +700,7 @@
           <w:color w:val="555555"/>
           <w:sz w:val="18"/>
         </w:rPr>
-        <w:t>현재 · 경기 안성 소재</w:t>
+        <w:t>현재 · 경기 안성</w:t>
       </w:r>
     </w:p>
     <w:p>
@@ -696,9 +712,9 @@
         <w:rPr>
           <w:rFonts w:ascii="Malgun Gothic" w:hAnsi="Malgun Gothic" w:eastAsia="Malgun Gothic"/>
           <w:b w:val="0"/>
-          <w:sz w:val="21"/>
+          <w:sz w:val="20"/>
         </w:rPr>
-        <w:t>축산 환경 컨설팅, 바이오 베딩, 악취·탄소 저감, 퇴비화 기술 개발</w:t>
+        <w:t>바이오 베딩·악취·탄소 저감·퇴비화 기술 개발 (D2O 베딩·Dr.Ha Liquid 등)</w:t>
       </w:r>
     </w:p>
     <w:p>
@@ -710,9 +726,46 @@
         <w:rPr>
           <w:rFonts w:ascii="Malgun Gothic" w:hAnsi="Malgun Gothic" w:eastAsia="Malgun Gothic"/>
           <w:b w:val="0"/>
-          <w:sz w:val="21"/>
+          <w:sz w:val="20"/>
         </w:rPr>
-        <w:t>D2O 베딩 시스템(피트모스+톱밥 부숙 베딩) — 악취저감·동물복지·생산성·프리미엄 퇴비</w:t>
+        <w:t>산업통상자원부 3년 R&amp;D 공동연구개발기관 연구책임자 (실증지원·33개월)</w:t>
+      </w:r>
+    </w:p>
+    <w:p>
+      <w:pPr>
+        <w:spacing w:before="100" w:after="20"/>
+      </w:pPr>
+      <w:r>
+        <w:rPr>
+          <w:rFonts w:ascii="Malgun Gothic" w:hAnsi="Malgun Gothic" w:eastAsia="Malgun Gothic"/>
+          <w:b/>
+          <w:color w:val="1A2E4F"/>
+          <w:sz w:val="22"/>
+        </w:rPr>
+        <w:t>건국대학교 수의과대학</w:t>
+      </w:r>
+      <w:r>
+        <w:rPr>
+          <w:rFonts w:ascii="Malgun Gothic" w:hAnsi="Malgun Gothic" w:eastAsia="Malgun Gothic"/>
+          <w:b w:val="0"/>
+          <w:color w:val="1B5E3A"/>
+          <w:sz w:val="19"/>
+        </w:rPr>
+        <w:t xml:space="preserve">   —  겸임교수</w:t>
+      </w:r>
+    </w:p>
+    <w:p>
+      <w:pPr>
+        <w:spacing w:after="40"/>
+      </w:pPr>
+      <w:r>
+        <w:rPr>
+          <w:rFonts w:ascii="Malgun Gothic" w:hAnsi="Malgun Gothic" w:eastAsia="Malgun Gothic"/>
+          <w:b w:val="0"/>
+          <w:color w:val="555555"/>
+          <w:sz w:val="18"/>
+        </w:rPr>
+        <w:t>현재</w:t>
       </w:r>
     </w:p>
     <w:p>
@@ -724,21 +777,174 @@
         <w:rPr>
           <w:rFonts w:ascii="Malgun Gothic" w:hAnsi="Malgun Gothic" w:eastAsia="Malgun Gothic"/>
           <w:b w:val="0"/>
-          <w:sz w:val="21"/>
+          <w:sz w:val="20"/>
         </w:rPr>
-        <w:t>산업통상자원부 3년 R&amp;D 공동연구개발기관 연구책임자 — 현장 실증·사업화 확산 담당</w:t>
+        <w:t>수의·축산 분야 교육 및 산학 연계</w:t>
       </w:r>
     </w:p>
     <w:p>
       <w:pPr>
-        <w:spacing w:before="120" w:after="20"/>
+        <w:spacing w:before="100" w:after="20"/>
       </w:pPr>
       <w:r>
         <w:rPr>
           <w:rFonts w:ascii="Malgun Gothic" w:hAnsi="Malgun Gothic" w:eastAsia="Malgun Gothic"/>
           <w:b/>
           <w:color w:val="1A2E4F"/>
-          <w:sz w:val="23"/>
+          <w:sz w:val="22"/>
+        </w:rPr>
+        <w:t>국립한경대학교</w:t>
+      </w:r>
+      <w:r>
+        <w:rPr>
+          <w:rFonts w:ascii="Malgun Gothic" w:hAnsi="Malgun Gothic" w:eastAsia="Malgun Gothic"/>
+          <w:b w:val="0"/>
+          <w:color w:val="1B5E3A"/>
+          <w:sz w:val="19"/>
+        </w:rPr>
+        <w:t xml:space="preserve">   —  축산전문강사 · 협력목장</w:t>
+      </w:r>
+    </w:p>
+    <w:p>
+      <w:pPr>
+        <w:spacing w:after="40"/>
+      </w:pPr>
+      <w:r>
+        <w:rPr>
+          <w:rFonts w:ascii="Malgun Gothic" w:hAnsi="Malgun Gothic" w:eastAsia="Malgun Gothic"/>
+          <w:b w:val="0"/>
+          <w:color w:val="555555"/>
+          <w:sz w:val="18"/>
+        </w:rPr>
+        <w:t>2016 – 현재 · 경기 안성</w:t>
+      </w:r>
+    </w:p>
+    <w:p>
+      <w:pPr>
+        <w:pStyle w:val="ListBullet"/>
+        <w:spacing w:after="40"/>
+      </w:pPr>
+      <w:r>
+        <w:rPr>
+          <w:rFonts w:ascii="Malgun Gothic" w:hAnsi="Malgun Gothic" w:eastAsia="Malgun Gothic"/>
+          <w:b w:val="0"/>
+          <w:sz w:val="20"/>
+        </w:rPr>
+        <w:t>축산 전문 교육 및 협력목장 운영 (산학 실증 기반)</w:t>
+      </w:r>
+    </w:p>
+    <w:p>
+      <w:pPr>
+        <w:spacing w:before="100" w:after="20"/>
+      </w:pPr>
+      <w:r>
+        <w:rPr>
+          <w:rFonts w:ascii="Malgun Gothic" w:hAnsi="Malgun Gothic" w:eastAsia="Malgun Gothic"/>
+          <w:b/>
+          <w:color w:val="1A2E4F"/>
+          <w:sz w:val="22"/>
+        </w:rPr>
+        <w:t>KOICA · KOPIA</w:t>
+      </w:r>
+      <w:r>
+        <w:rPr>
+          <w:rFonts w:ascii="Malgun Gothic" w:hAnsi="Malgun Gothic" w:eastAsia="Malgun Gothic"/>
+          <w:b w:val="0"/>
+          <w:color w:val="1B5E3A"/>
+          <w:sz w:val="19"/>
+        </w:rPr>
+        <w:t xml:space="preserve">   —  국제협력 전문요원</w:t>
+      </w:r>
+    </w:p>
+    <w:p>
+      <w:pPr>
+        <w:spacing w:after="40"/>
+      </w:pPr>
+      <w:r>
+        <w:rPr>
+          <w:rFonts w:ascii="Malgun Gothic" w:hAnsi="Malgun Gothic" w:eastAsia="Malgun Gothic"/>
+          <w:b w:val="0"/>
+          <w:color w:val="555555"/>
+          <w:sz w:val="18"/>
+        </w:rPr>
+        <w:t>—</w:t>
+      </w:r>
+    </w:p>
+    <w:p>
+      <w:pPr>
+        <w:pStyle w:val="ListBullet"/>
+        <w:spacing w:after="40"/>
+      </w:pPr>
+      <w:r>
+        <w:rPr>
+          <w:rFonts w:ascii="Malgun Gothic" w:hAnsi="Malgun Gothic" w:eastAsia="Malgun Gothic"/>
+          <w:b w:val="0"/>
+          <w:sz w:val="20"/>
+        </w:rPr>
+        <w:t>개도국 축산 기술협력·교육 전문요원</w:t>
+      </w:r>
+    </w:p>
+    <w:p>
+      <w:pPr>
+        <w:spacing w:before="100" w:after="20"/>
+      </w:pPr>
+      <w:r>
+        <w:rPr>
+          <w:rFonts w:ascii="Malgun Gothic" w:hAnsi="Malgun Gothic" w:eastAsia="Malgun Gothic"/>
+          <w:b/>
+          <w:color w:val="1A2E4F"/>
+          <w:sz w:val="22"/>
+        </w:rPr>
+        <w:t>Eco-BIT 플랫폼 · CowTalk AI</w:t>
+      </w:r>
+      <w:r>
+        <w:rPr>
+          <w:rFonts w:ascii="Malgun Gothic" w:hAnsi="Malgun Gothic" w:eastAsia="Malgun Gothic"/>
+          <w:b w:val="0"/>
+          <w:color w:val="1B5E3A"/>
+          <w:sz w:val="19"/>
+        </w:rPr>
+        <w:t xml:space="preserve">   —  창업자 / 총괄 설계자</w:t>
+      </w:r>
+    </w:p>
+    <w:p>
+      <w:pPr>
+        <w:spacing w:after="40"/>
+      </w:pPr>
+      <w:r>
+        <w:rPr>
+          <w:rFonts w:ascii="Malgun Gothic" w:hAnsi="Malgun Gothic" w:eastAsia="Malgun Gothic"/>
+          <w:b w:val="0"/>
+          <w:color w:val="555555"/>
+          <w:sz w:val="18"/>
+        </w:rPr>
+        <w:t>현재 진행</w:t>
+      </w:r>
+    </w:p>
+    <w:p>
+      <w:pPr>
+        <w:pStyle w:val="ListBullet"/>
+        <w:spacing w:after="40"/>
+      </w:pPr>
+      <w:r>
+        <w:rPr>
+          <w:rFonts w:ascii="Malgun Gothic" w:hAnsi="Malgun Gothic" w:eastAsia="Malgun Gothic"/>
+          <w:b w:val="0"/>
+          <w:sz w:val="20"/>
+        </w:rPr>
+        <w:t>Bio+Biotech+IT 통합 정밀축산 디지털 플랫폼 — 위내센서·AI 예측·축산행정 대시보드</w:t>
+      </w:r>
+    </w:p>
+    <w:p>
+      <w:pPr>
+        <w:spacing w:before="100" w:after="20"/>
+      </w:pPr>
+      <w:r>
+        <w:rPr>
+          <w:rFonts w:ascii="Malgun Gothic" w:hAnsi="Malgun Gothic" w:eastAsia="Malgun Gothic"/>
+          <w:b/>
+          <w:color w:val="1A2E4F"/>
+          <w:sz w:val="22"/>
         </w:rPr>
         <w:t>㈜대한사료공업</w:t>
       </w:r>
@@ -747,7 +953,7 @@
           <w:rFonts w:ascii="Malgun Gothic" w:hAnsi="Malgun Gothic" w:eastAsia="Malgun Gothic"/>
           <w:b w:val="0"/>
           <w:color w:val="1B5E3A"/>
-          <w:sz w:val="20"/>
+          <w:sz w:val="19"/>
         </w:rPr>
         <w:t xml:space="preserve">   —  기술지원</w:t>
       </w:r>
@@ -775,74 +981,9 @@
         <w:rPr>
           <w:rFonts w:ascii="Malgun Gothic" w:hAnsi="Malgun Gothic" w:eastAsia="Malgun Gothic"/>
           <w:b w:val="0"/>
-          <w:sz w:val="21"/>
-        </w:rPr>
-        <w:t>축산 사양·현장 기술지원 등 장기 실무 수행</w:t>
-      </w:r>
-    </w:p>
-    <w:p>
-      <w:pPr>
-        <w:spacing w:before="120" w:after="20"/>
-      </w:pPr>
-      <w:r>
-        <w:rPr>
-          <w:rFonts w:ascii="Malgun Gothic" w:hAnsi="Malgun Gothic" w:eastAsia="Malgun Gothic"/>
-          <w:b/>
-          <w:color w:val="1A2E4F"/>
-          <w:sz w:val="23"/>
-        </w:rPr>
-        <w:t>Eco-BIT 플랫폼 · CowTalk AI</w:t>
-      </w:r>
-      <w:r>
-        <w:rPr>
-          <w:rFonts w:ascii="Malgun Gothic" w:hAnsi="Malgun Gothic" w:eastAsia="Malgun Gothic"/>
-          <w:b w:val="0"/>
-          <w:color w:val="1B5E3A"/>
           <w:sz w:val="20"/>
         </w:rPr>
-        <w:t xml:space="preserve">   —  창업자 / 총괄 설계자</w:t>
-      </w:r>
-    </w:p>
-    <w:p>
-      <w:pPr>
-        <w:spacing w:after="40"/>
-      </w:pPr>
-      <w:r>
-        <w:rPr>
-          <w:rFonts w:ascii="Malgun Gothic" w:hAnsi="Malgun Gothic" w:eastAsia="Malgun Gothic"/>
-          <w:b w:val="0"/>
-          <w:color w:val="555555"/>
-          <w:sz w:val="18"/>
-        </w:rPr>
-        <w:t>현재 진행</w:t>
-      </w:r>
-    </w:p>
-    <w:p>
-      <w:pPr>
-        <w:pStyle w:val="ListBullet"/>
-        <w:spacing w:after="40"/>
-      </w:pPr>
-      <w:r>
-        <w:rPr>
-          <w:rFonts w:ascii="Malgun Gothic" w:hAnsi="Malgun Gothic" w:eastAsia="Malgun Gothic"/>
-          <w:b w:val="0"/>
-          <w:sz w:val="21"/>
-        </w:rPr>
-        <w:t>Bio+Biotechnology+IT 통합 정밀축산 디지털 플랫폼 설계·구축</w:t>
-      </w:r>
-    </w:p>
-    <w:p>
-      <w:pPr>
-        <w:pStyle w:val="ListBullet"/>
-        <w:spacing w:after="40"/>
-      </w:pPr>
-      <w:r>
-        <w:rPr>
-          <w:rFonts w:ascii="Malgun Gothic" w:hAnsi="Malgun Gothic" w:eastAsia="Malgun Gothic"/>
-          <w:b w:val="0"/>
-          <w:sz w:val="21"/>
-        </w:rPr>
-        <w:t>위내센서·AI 모니터링·번식·질병/분만 예측, 지자체·방역기관용 축산행정 대시보드</w:t>
+        <w:t>축산 사양·현장 기술지원 장기 실무</w:t>
       </w:r>
     </w:p>
     <w:p>
@@ -859,7 +1000,7 @@
           <w:color w:val="1A2E4F"/>
           <w:sz w:val="25"/>
         </w:rPr>
-        <w:t>학력 및 자격 (Education &amp; Credentials)</w:t>
+        <w:t>학력 · 자격 · 지식재산 (Education / Credentials / IP)</w:t>
       </w:r>
     </w:p>
     <w:p>
@@ -887,7 +1028,7 @@
           <w:b w:val="0"/>
           <w:sz w:val="21"/>
         </w:rPr>
-        <w:t>수의사 면허 — [입력 필요: 면허번호]</w:t>
+        <w:t>수의사 면허 제10193호 · 국가연구자번호 11152141</w:t>
       </w:r>
     </w:p>
     <w:p>
@@ -901,7 +1042,21 @@
           <w:b w:val="0"/>
           <w:sz w:val="21"/>
         </w:rPr>
-        <w:t>국가연구자번호 11152141</w:t>
+        <w:t>건국대학교 수의과대학 겸임교수 · 국립한경대학교 축산전문강사</w:t>
+      </w:r>
+    </w:p>
+    <w:p>
+      <w:pPr>
+        <w:pStyle w:val="ListBullet"/>
+        <w:spacing w:after="40"/>
+      </w:pPr>
+      <w:r>
+        <w:rPr>
+          <w:rFonts w:ascii="Malgun Gothic" w:hAnsi="Malgun Gothic" w:eastAsia="Malgun Gothic"/>
+          <w:b w:val="0"/>
+          <w:sz w:val="21"/>
+        </w:rPr>
+        <w:t>특허 2건 보유 (축산환경·정밀축산 분야) — [세부: 출원·등록번호 추후 보완]</w:t>
       </w:r>
     </w:p>
     <w:p>
@@ -918,82 +1073,142 @@
           <w:color w:val="1A2E4F"/>
           <w:sz w:val="25"/>
         </w:rPr>
-        <w:t>공공·정책 협력 및 대표 사업 (Public &amp; Policy Engagement)</w:t>
+        <w:t>목장 인증 현황 (Farm Certifications)</w:t>
       </w:r>
     </w:p>
+    <w:tbl>
+      <w:tblPr>
+        <w:tblW w:type="auto" w:w="0"/>
+        <w:tblLook w:firstColumn="1" w:firstRow="1" w:lastColumn="0" w:lastRow="0" w:noHBand="0" w:noVBand="1" w:val="04A0"/>
+      </w:tblPr>
+      <w:tblGrid>
+        <w:gridCol w:w="5043"/>
+        <w:gridCol w:w="5043"/>
+      </w:tblGrid>
+      <w:tr>
+        <w:tc>
+          <w:tcPr>
+            <w:tcW w:type="dxa" w:w="5043"/>
+          </w:tcPr>
+          <w:p>
+            <w:pPr>
+              <w:spacing w:after="20"/>
+            </w:pPr>
+            <w:r>
+              <w:rPr>
+                <w:rFonts w:ascii="Malgun Gothic" w:hAnsi="Malgun Gothic" w:eastAsia="Malgun Gothic"/>
+                <w:b w:val="0"/>
+                <w:color w:val="1B5E3A"/>
+                <w:sz w:val="20"/>
+              </w:rPr>
+              <w:t>✔  국내 1호 젖소 동물복지 인증목장</w:t>
+            </w:r>
+          </w:p>
+        </w:tc>
+        <w:tc>
+          <w:tcPr>
+            <w:tcW w:type="dxa" w:w="5043"/>
+          </w:tcPr>
+          <w:p>
+            <w:pPr>
+              <w:spacing w:after="20"/>
+            </w:pPr>
+            <w:r>
+              <w:rPr>
+                <w:rFonts w:ascii="Malgun Gothic" w:hAnsi="Malgun Gothic" w:eastAsia="Malgun Gothic"/>
+                <w:b w:val="0"/>
+                <w:color w:val="1B5E3A"/>
+                <w:sz w:val="20"/>
+              </w:rPr>
+              <w:t>✔  경기도 가축행복농장 인증</w:t>
+            </w:r>
+          </w:p>
+        </w:tc>
+      </w:tr>
+      <w:tr>
+        <w:tc>
+          <w:tcPr>
+            <w:tcW w:type="dxa" w:w="5043"/>
+          </w:tcPr>
+          <w:p>
+            <w:pPr>
+              <w:spacing w:after="20"/>
+            </w:pPr>
+            <w:r>
+              <w:rPr>
+                <w:rFonts w:ascii="Malgun Gothic" w:hAnsi="Malgun Gothic" w:eastAsia="Malgun Gothic"/>
+                <w:b w:val="0"/>
+                <w:color w:val="1B5E3A"/>
+                <w:sz w:val="20"/>
+              </w:rPr>
+              <w:t>✔  국내 1호 젖소 저탄소 인증목장</w:t>
+            </w:r>
+          </w:p>
+        </w:tc>
+        <w:tc>
+          <w:tcPr>
+            <w:tcW w:type="dxa" w:w="5043"/>
+          </w:tcPr>
+          <w:p>
+            <w:pPr>
+              <w:spacing w:after="20"/>
+            </w:pPr>
+            <w:r>
+              <w:rPr>
+                <w:rFonts w:ascii="Malgun Gothic" w:hAnsi="Malgun Gothic" w:eastAsia="Malgun Gothic"/>
+                <w:b w:val="0"/>
+                <w:color w:val="1B5E3A"/>
+                <w:sz w:val="20"/>
+              </w:rPr>
+              <w:t>✔  국내 1호 스마트팜 교육목장(농림부)</w:t>
+            </w:r>
+          </w:p>
+        </w:tc>
+      </w:tr>
+      <w:tr>
+        <w:tc>
+          <w:tcPr>
+            <w:tcW w:type="dxa" w:w="5043"/>
+          </w:tcPr>
+          <w:p>
+            <w:pPr>
+              <w:spacing w:after="20"/>
+            </w:pPr>
+            <w:r>
+              <w:rPr>
+                <w:rFonts w:ascii="Malgun Gothic" w:hAnsi="Malgun Gothic" w:eastAsia="Malgun Gothic"/>
+                <w:b w:val="0"/>
+                <w:color w:val="1B5E3A"/>
+                <w:sz w:val="20"/>
+              </w:rPr>
+              <w:t>✔  깨끗한 목장 인증</w:t>
+            </w:r>
+          </w:p>
+        </w:tc>
+        <w:tc>
+          <w:tcPr>
+            <w:tcW w:type="dxa" w:w="5043"/>
+          </w:tcPr>
+          <w:p>
+            <w:pPr>
+              <w:spacing w:after="20"/>
+            </w:pPr>
+            <w:r>
+              <w:rPr>
+                <w:rFonts w:ascii="Malgun Gothic" w:hAnsi="Malgun Gothic" w:eastAsia="Malgun Gothic"/>
+                <w:b w:val="0"/>
+                <w:color w:val="1B5E3A"/>
+                <w:sz w:val="20"/>
+              </w:rPr>
+              <w:t>✔  경기도 저지전용목장 2호</w:t>
+            </w:r>
+          </w:p>
+        </w:tc>
+      </w:tr>
+    </w:tbl>
     <w:p>
       <w:pPr>
-        <w:pStyle w:val="ListBullet"/>
-        <w:spacing w:after="40"/>
-      </w:pPr>
-      <w:r>
-        <w:rPr>
-          <w:rFonts w:ascii="Malgun Gothic" w:hAnsi="Malgun Gothic" w:eastAsia="Malgun Gothic"/>
-          <w:b w:val="0"/>
-          <w:sz w:val="21"/>
-        </w:rPr>
-        <w:t>산업통상자원부(MOTIE) 3년 R&amp;D 과제 공동연구개발기관 연구책임자 (㈜D2O · 실증지원 · 총 33개월)</w:t>
-      </w:r>
-    </w:p>
-    <w:p>
-      <w:pPr>
-        <w:pStyle w:val="ListBullet"/>
-        <w:spacing w:after="40"/>
-      </w:pPr>
-      <w:r>
-        <w:rPr>
-          <w:rFonts w:ascii="Malgun Gothic" w:hAnsi="Malgun Gothic" w:eastAsia="Malgun Gothic"/>
-          <w:b w:val="0"/>
-          <w:sz w:val="21"/>
-        </w:rPr>
-        <w:t>경기도 AI 축산행정 플랫폼 연계 — 정밀축산 센서·데이터 기반 행정 전환 사업 참여 추진</w:t>
-      </w:r>
-    </w:p>
-    <w:p>
-      <w:pPr>
-        <w:pStyle w:val="ListBullet"/>
-        <w:spacing w:after="40"/>
-      </w:pPr>
-      <w:r>
-        <w:rPr>
-          <w:rFonts w:ascii="Malgun Gothic" w:hAnsi="Malgun Gothic" w:eastAsia="Malgun Gothic"/>
-          <w:b w:val="0"/>
-          <w:sz w:val="21"/>
-        </w:rPr>
-        <w:t>축산환경기술(악취·분뇨·탄소) 및 순환농업(Healing Compost) 현장 적용</w:t>
-      </w:r>
-    </w:p>
-    <w:p>
-      <w:pPr>
-        <w:pStyle w:val="ListBullet"/>
-        <w:spacing w:after="40"/>
-      </w:pPr>
-      <w:r>
-        <w:rPr>
-          <w:rFonts w:ascii="Malgun Gothic" w:hAnsi="Malgun Gothic" w:eastAsia="Malgun Gothic"/>
-          <w:b w:val="0"/>
-          <w:sz w:val="21"/>
-        </w:rPr>
-        <w:t>프리미엄 유가공 브랜드(A2 Hay Milk) 등 축산 6차산업 사업화</w:t>
-      </w:r>
-    </w:p>
-    <w:p>
-      <w:pPr>
-        <w:pStyle w:val="ListBullet"/>
-        <w:spacing w:after="40"/>
-      </w:pPr>
-      <w:r>
-        <w:rPr>
-          <w:rFonts w:ascii="Malgun Gothic" w:hAnsi="Malgun Gothic" w:eastAsia="Malgun Gothic"/>
-          <w:b w:val="0"/>
-          <w:sz w:val="21"/>
-        </w:rPr>
-        <w:t>축산 환경기술 관련 특허 — [입력 필요: 출원/등록 내역]</w:t>
-      </w:r>
-    </w:p>
-    <w:p>
-      <w:pPr>
-        <w:spacing w:before="200"/>
+        <w:spacing w:before="160"/>
       </w:pPr>
       <w:r>
         <w:rPr>
@@ -1002,12 +1217,12 @@
           <w:color w:val="555555"/>
           <w:sz w:val="17"/>
         </w:rPr>
-        <w:t>※ [입력 필요] 항목은 공개 가능 정보 확인 후 보완. 본 이력서는 경기도지사직 인수위원회 축산·방역 분야 위원 지원용으로 작성되었습니다.</w:t>
+        <w:t>※ 특허 세부 정보는 공개 가능 범위 확인 후 보완. 본 이력서는 경기도지사직 인수위원회 축산·동물방역 분야 위원 지원용입니다.</w:t>
       </w:r>
     </w:p>
     <w:sectPr>
       <w:pgSz w:w="12240" w:h="15840"/>
-      <w:pgMar w:top="850" w:right="1134" w:bottom="850" w:left="1134" w:header="720" w:footer="720" w:gutter="0"/>
+      <w:pgMar w:top="794" w:right="1077" w:bottom="794" w:left="1077" w:header="720" w:footer="720" w:gutter="0"/>
       <w:cols w:space="720"/>
       <w:docGrid w:linePitch="360"/>
     </w:sectPr>

</xml_diff>